<commit_message>
chore: 更新文档 + 新增 kf-autoresearch/kf-doc-consistency 技能
Co-Authored-By: claude-flow <ruv@ruv.net>
</commit_message>
<xml_diff>
--- a/docs/AICoding原则.docx
+++ b/docs/AICoding原则.docx
@@ -378,6 +378,22 @@
     </w:p>
     <w:p>
       <w:pPr>
+        <w:bidi w:val="0"/>
+        <w:rPr>
+          <w:rFonts w:hint="default"/>
+          <w:lang w:val="en-US" w:eastAsia="zh-CN"/>
+        </w:rPr>
+      </w:pPr>
+      <w:r>
+        <w:rPr>
+          <w:rFonts w:hint="eastAsia"/>
+          <w:lang w:val="en-US" w:eastAsia="zh-CN"/>
+        </w:rPr>
+        <w:t>不同工作适合不同的模式。这样不会造成浪费。</w:t>
+      </w:r>
+    </w:p>
+    <w:p>
+      <w:pPr>
         <w:pStyle w:val="3"/>
         <w:bidi w:val="0"/>
         <w:rPr>
@@ -390,23 +406,23 @@
           <w:rFonts w:hint="eastAsia"/>
           <w:lang w:val="en-US" w:eastAsia="zh-CN"/>
         </w:rPr>
-        <w:t>省输入——skill-Rtk （skill）</w:t>
-      </w:r>
-    </w:p>
-    <w:p>
-      <w:pPr>
-        <w:bidi w:val="0"/>
-        <w:rPr>
-          <w:rFonts w:hint="default"/>
-          <w:lang w:val="en-US" w:eastAsia="zh-CN"/>
-        </w:rPr>
-      </w:pPr>
-      <w:r>
-        <w:rPr>
-          <w:rFonts w:hint="eastAsia"/>
-          <w:lang w:val="en-US" w:eastAsia="zh-CN"/>
-        </w:rPr>
-        <w:t>原理：</w:t>
+        <w:t>省输入——skill-Rtk+context mode （skill）</w:t>
+      </w:r>
+    </w:p>
+    <w:p>
+      <w:pPr>
+        <w:bidi w:val="0"/>
+        <w:rPr>
+          <w:rFonts w:hint="default"/>
+          <w:lang w:val="en-US" w:eastAsia="zh-CN"/>
+        </w:rPr>
+      </w:pPr>
+      <w:r>
+        <w:rPr>
+          <w:rFonts w:hint="eastAsia"/>
+          <w:lang w:val="en-US" w:eastAsia="zh-CN"/>
+        </w:rPr>
+        <w:t>Rtk原理：</w:t>
       </w:r>
     </w:p>
     <w:p>
@@ -461,7 +477,7 @@
       <w:pPr>
         <w:bidi w:val="0"/>
         <w:rPr>
-          <w:rFonts w:hint="default"/>
+          <w:rFonts w:hint="eastAsia"/>
           <w:lang w:val="en-US" w:eastAsia="zh-CN"/>
         </w:rPr>
       </w:pPr>
@@ -471,6 +487,40 @@
           <w:lang w:val="en-US" w:eastAsia="zh-CN"/>
         </w:rPr>
         <w:t>截断保留</w:t>
+      </w:r>
+    </w:p>
+    <w:p>
+      <w:pPr>
+        <w:bidi w:val="0"/>
+        <w:rPr>
+          <w:rFonts w:hint="eastAsia"/>
+          <w:lang w:val="en-US" w:eastAsia="zh-CN"/>
+        </w:rPr>
+      </w:pPr>
+      <w:r>
+        <w:rPr>
+          <w:rFonts w:hint="eastAsia"/>
+          <w:lang w:val="en-US" w:eastAsia="zh-CN"/>
+        </w:rPr>
+        <w:t>Contet mode 原理：</w:t>
+      </w:r>
+    </w:p>
+    <w:p>
+      <w:pPr>
+        <w:bidi w:val="0"/>
+        <w:rPr>
+          <w:rFonts w:hint="default"/>
+          <w:lang w:val="en-US" w:eastAsia="zh-CN"/>
+        </w:rPr>
+      </w:pPr>
+      <w:bookmarkStart w:id="0" w:name="_GoBack"/>
+      <w:bookmarkEnd w:id="0"/>
+      <w:r>
+        <w:rPr>
+          <w:rFonts w:hint="eastAsia"/>
+          <w:lang w:val="en-US" w:eastAsia="zh-CN"/>
+        </w:rPr>
+        <w:t>代码索引</w:t>
       </w:r>
     </w:p>
     <w:p>
@@ -863,8 +913,6 @@
         </w:rPr>
         <w:t>如果是每队里面4个agent:做文档，分为网络查询师，指定附件或知识库总结分析师，撰写检查师。共计3*4+2=14个agent</w:t>
       </w:r>
-      <w:bookmarkStart w:id="0" w:name="_GoBack"/>
-      <w:bookmarkEnd w:id="0"/>
     </w:p>
     <w:p>
       <w:pPr>

</xml_diff>